<commit_message>
docs: update SRD functional requirements and add Template 3
</commit_message>
<xml_diff>
--- a/folder_template/Template2_SRD Document.docx
+++ b/folder_template/Template2_SRD Document.docx
@@ -6122,452 +6122,912 @@
     <w:p>
       <w:pPr>
         <w:pStyle w:val="Heading2"/>
-        <w:rPr/>
       </w:pPr>
-      <w:bookmarkStart w:colFirst="0" w:colLast="0" w:name="_bzdfq8ber5sr" w:id="11"/>
-      <w:bookmarkEnd w:id="11"/>
-      <w:r>
-        <w:rPr>
-          <w:rtl w:val="0"/>
-        </w:rPr>
-        <w:t xml:space="preserve">1. &lt;&lt;Feature Name 1&gt;&gt;</w:t>
+      <w:r>
+        <w:t>1. Horse Owner Management</w:t>
       </w:r>
     </w:p>
     <w:p>
       <w:pPr>
         <w:pStyle w:val="Heading3"/>
-        <w:rPr/>
       </w:pPr>
-      <w:bookmarkStart w:colFirst="0" w:colLast="0" w:name="_kcqkaye8n1ne" w:id="12"/>
-      <w:bookmarkEnd w:id="12"/>
-      <w:r>
-        <w:rPr>
-          <w:rtl w:val="0"/>
-        </w:rPr>
-        <w:t xml:space="preserve">a. &lt;&lt;Function Name 1&gt;&gt;</w:t>
-      </w:r>
-    </w:p>
-    <w:p>
-      <w:pPr>
-        <w:spacing w:after="60" w:line="240" w:lineRule="auto"/>
-        <w:jc w:val="both"/>
-        <w:rPr>
-          <w:i w:val="1"/>
-          <w:iCs w:val="1"/>
-          <w:color w:val="0000ff"/>
-        </w:rPr>
-      </w:pPr>
-      <w:r>
-        <w:rPr>
-          <w:i w:val="1"/>
-          <w:iCs w:val="1"/>
-          <w:color w:val="0000ff"/>
-          <w:rtl w:val="0"/>
-        </w:rPr>
-        <w:t xml:space="preserve">[A function can be a screen or a non-screen function (listed in the part I.2.d above). In this part, you need to provide the details on the related function, focus on mentioning below information</w:t>
-      </w:r>
-    </w:p>
-    <w:p>
-      <w:pPr>
-        <w:keepNext w:val="0"/>
-        <w:keepLines w:val="0"/>
-        <w:pageBreakBefore w:val="0"/>
-        <w:widowControl w:val="1"/>
-        <w:numPr>
-          <w:ilvl w:val="0"/>
-          <w:numId w:val="2"/>
-        </w:numPr>
-        <w:pBdr>
-          <w:top w:space="0" w:sz="0" w:val="nil"/>
-          <w:left w:space="0" w:sz="0" w:val="nil"/>
-          <w:bottom w:space="0" w:sz="0" w:val="nil"/>
-          <w:right w:space="0" w:sz="0" w:val="nil"/>
-          <w:between w:space="0" w:sz="0" w:val="nil"/>
-        </w:pBdr>
-        <w:shd w:fill="auto" w:val="clear"/>
-        <w:spacing w:after="0" w:before="0" w:line="259" w:lineRule="auto"/>
-        <w:ind w:left="720" w:right="0" w:hanging="360"/>
-        <w:jc w:val="left"/>
-        <w:rPr>
-          <w:b w:val="0"/>
-          <w:bCs w:val="0"/>
-          <w:i w:val="1"/>
-          <w:iCs w:val="1"/>
-          <w:smallCaps w:val="0"/>
-          <w:strike w:val="0"/>
-          <w:color w:val="0000ff"/>
-          <w:sz w:val="22"/>
-          <w:szCs w:val="22"/>
-          <w:u w:val="none"/>
-          <w:shd w:fill="auto" w:val="clear"/>
-          <w:vertAlign w:val="baseline"/>
-        </w:rPr>
-      </w:pPr>
-      <w:r>
-        <w:rPr>
-          <w:rFonts w:ascii="Calibri" w:cs="Calibri" w:eastAsia="Calibri" w:hAnsi="Calibri"/>
-          <w:b w:val="0"/>
-          <w:bCs w:val="0"/>
-          <w:i w:val="1"/>
-          <w:iCs w:val="1"/>
-          <w:smallCaps w:val="0"/>
-          <w:strike w:val="0"/>
-          <w:color w:val="0000ff"/>
-          <w:sz w:val="22"/>
-          <w:szCs w:val="22"/>
-          <w:u w:val="none"/>
-          <w:shd w:fill="auto" w:val="clear"/>
-          <w:vertAlign w:val="baseline"/>
-          <w:rtl w:val="0"/>
-        </w:rPr>
-        <w:t xml:space="preserve">Function trigger: how this function is triggered (navigation path, a timing frequency, etc.)</w:t>
-      </w:r>
-    </w:p>
-    <w:p>
-      <w:pPr>
-        <w:keepNext w:val="0"/>
-        <w:keepLines w:val="0"/>
-        <w:pageBreakBefore w:val="0"/>
-        <w:widowControl w:val="1"/>
-        <w:numPr>
-          <w:ilvl w:val="0"/>
-          <w:numId w:val="2"/>
-        </w:numPr>
-        <w:pBdr>
-          <w:top w:space="0" w:sz="0" w:val="nil"/>
-          <w:left w:space="0" w:sz="0" w:val="nil"/>
-          <w:bottom w:space="0" w:sz="0" w:val="nil"/>
-          <w:right w:space="0" w:sz="0" w:val="nil"/>
-          <w:between w:space="0" w:sz="0" w:val="nil"/>
-        </w:pBdr>
-        <w:shd w:fill="auto" w:val="clear"/>
-        <w:spacing w:after="0" w:before="0" w:line="259" w:lineRule="auto"/>
-        <w:ind w:left="720" w:right="0" w:hanging="360"/>
-        <w:jc w:val="left"/>
-        <w:rPr>
-          <w:b w:val="0"/>
-          <w:bCs w:val="0"/>
-          <w:i w:val="1"/>
-          <w:iCs w:val="1"/>
-          <w:smallCaps w:val="0"/>
-          <w:strike w:val="0"/>
-          <w:color w:val="0000ff"/>
-          <w:sz w:val="22"/>
-          <w:szCs w:val="22"/>
-          <w:u w:val="none"/>
-          <w:shd w:fill="auto" w:val="clear"/>
-          <w:vertAlign w:val="baseline"/>
-        </w:rPr>
-      </w:pPr>
-      <w:r>
-        <w:rPr>
-          <w:rFonts w:ascii="Calibri" w:cs="Calibri" w:eastAsia="Calibri" w:hAnsi="Calibri"/>
-          <w:b w:val="0"/>
-          <w:bCs w:val="0"/>
-          <w:i w:val="1"/>
-          <w:iCs w:val="1"/>
-          <w:smallCaps w:val="0"/>
-          <w:strike w:val="0"/>
-          <w:color w:val="0000ff"/>
-          <w:sz w:val="22"/>
-          <w:szCs w:val="22"/>
-          <w:u w:val="none"/>
-          <w:shd w:fill="auto" w:val="clear"/>
-          <w:vertAlign w:val="baseline"/>
-          <w:rtl w:val="0"/>
-        </w:rPr>
-        <w:t xml:space="preserve">Function description: actors/roles, purpose, interface, data processing, etc.</w:t>
-      </w:r>
-    </w:p>
-    <w:p>
-      <w:pPr>
-        <w:keepNext w:val="0"/>
-        <w:keepLines w:val="0"/>
-        <w:pageBreakBefore w:val="0"/>
-        <w:widowControl w:val="1"/>
-        <w:numPr>
-          <w:ilvl w:val="0"/>
-          <w:numId w:val="2"/>
-        </w:numPr>
-        <w:pBdr>
-          <w:top w:space="0" w:sz="0" w:val="nil"/>
-          <w:left w:space="0" w:sz="0" w:val="nil"/>
-          <w:bottom w:space="0" w:sz="0" w:val="nil"/>
-          <w:right w:space="0" w:sz="0" w:val="nil"/>
-          <w:between w:space="0" w:sz="0" w:val="nil"/>
-        </w:pBdr>
-        <w:shd w:fill="auto" w:val="clear"/>
-        <w:spacing w:after="0" w:before="0" w:line="259" w:lineRule="auto"/>
-        <w:ind w:left="720" w:right="0" w:hanging="360"/>
-        <w:jc w:val="left"/>
-        <w:rPr>
-          <w:b w:val="0"/>
-          <w:bCs w:val="0"/>
-          <w:i w:val="1"/>
-          <w:iCs w:val="1"/>
-          <w:smallCaps w:val="0"/>
-          <w:strike w:val="0"/>
-          <w:color w:val="0000ff"/>
-          <w:sz w:val="22"/>
-          <w:szCs w:val="22"/>
-          <w:u w:val="none"/>
-          <w:shd w:fill="auto" w:val="clear"/>
-          <w:vertAlign w:val="baseline"/>
-        </w:rPr>
-      </w:pPr>
-      <w:r>
-        <w:rPr>
-          <w:rFonts w:ascii="Calibri" w:cs="Calibri" w:eastAsia="Calibri" w:hAnsi="Calibri"/>
-          <w:b w:val="0"/>
-          <w:bCs w:val="0"/>
-          <w:i w:val="1"/>
-          <w:iCs w:val="1"/>
-          <w:smallCaps w:val="0"/>
-          <w:strike w:val="0"/>
-          <w:color w:val="0000ff"/>
-          <w:sz w:val="22"/>
-          <w:szCs w:val="22"/>
-          <w:u w:val="none"/>
-          <w:shd w:fill="auto" w:val="clear"/>
-          <w:vertAlign w:val="baseline"/>
-          <w:rtl w:val="0"/>
-        </w:rPr>
-        <w:t xml:space="preserve">Screen layout: mockup prototype of the screen, sample below is for Manage Products screen</w:t>
-      </w:r>
-    </w:p>
-    <w:p>
-      <w:pPr>
-        <w:keepNext w:val="0"/>
-        <w:keepLines w:val="0"/>
-        <w:pageBreakBefore w:val="0"/>
-        <w:widowControl w:val="1"/>
-        <w:pBdr>
-          <w:top w:space="0" w:sz="0" w:val="nil"/>
-          <w:left w:space="0" w:sz="0" w:val="nil"/>
-          <w:bottom w:space="0" w:sz="0" w:val="nil"/>
-          <w:right w:space="0" w:sz="0" w:val="nil"/>
-          <w:between w:space="0" w:sz="0" w:val="nil"/>
-        </w:pBdr>
-        <w:shd w:fill="auto" w:val="clear"/>
-        <w:spacing w:after="0" w:before="0" w:line="259" w:lineRule="auto"/>
-        <w:ind w:left="720" w:right="0" w:firstLine="0"/>
-        <w:jc w:val="left"/>
-        <w:rPr>
-          <w:rFonts w:ascii="Calibri" w:cs="Calibri" w:eastAsia="Calibri" w:hAnsi="Calibri"/>
-          <w:b w:val="0"/>
-          <w:bCs w:val="0"/>
-          <w:i w:val="1"/>
-          <w:iCs w:val="1"/>
-          <w:smallCaps w:val="0"/>
-          <w:strike w:val="0"/>
-          <w:color w:val="000000"/>
-          <w:sz w:val="22"/>
-          <w:szCs w:val="22"/>
-          <w:u w:val="none"/>
-          <w:shd w:fill="auto" w:val="clear"/>
-          <w:vertAlign w:val="baseline"/>
-        </w:rPr>
-      </w:pPr>
-      <w:r>
-        <w:rPr>
-          <w:rFonts w:ascii="Calibri" w:cs="Calibri" w:eastAsia="Calibri" w:hAnsi="Calibri"/>
-          <w:b w:val="0"/>
-          <w:bCs w:val="0"/>
-          <w:i w:val="1"/>
-          <w:iCs w:val="1"/>
-          <w:smallCaps w:val="0"/>
-          <w:strike w:val="0"/>
-          <w:color w:val="000000"/>
-          <w:sz w:val="22"/>
-          <w:szCs w:val="22"/>
-          <w:u w:val="none"/>
-          <w:shd w:fill="auto" w:val="clear"/>
-          <w:vertAlign w:val="baseline"/>
-        </w:rPr>
-        <w:drawing>
-          <wp:inline distB="0" distT="0" distL="0" distR="0">
-            <wp:extent cx="5278510" cy="2743075"/>
-            <wp:effectExtent b="0" l="0" r="0" t="0"/>
-            <wp:docPr id="5" name="image5.png"/>
-            <a:graphic>
-              <a:graphicData uri="http://schemas.openxmlformats.org/drawingml/2006/picture">
-                <pic:pic>
-                  <pic:nvPicPr>
-                    <pic:cNvPr id="0" name="image5.png"/>
-                    <pic:cNvPicPr preferRelativeResize="0"/>
-                  </pic:nvPicPr>
-                  <pic:blipFill>
-                    <a:blip r:embed="rId12"/>
-                    <a:srcRect b="0" l="0" r="0" t="0"/>
-                    <a:stretch>
-                      <a:fillRect/>
-                    </a:stretch>
-                  </pic:blipFill>
-                  <pic:spPr>
-                    <a:xfrm>
-                      <a:off x="0" y="0"/>
-                      <a:ext cx="5278510" cy="2743075"/>
-                    </a:xfrm>
-                    <a:prstGeom prst="rect"/>
-                    <a:ln/>
-                  </pic:spPr>
-                </pic:pic>
-              </a:graphicData>
-            </a:graphic>
-          </wp:inline>
-        </w:drawing>
-      </w:r>
-      <w:r>
-        <w:rPr>
-          <w:rtl w:val="0"/>
-        </w:rPr>
-      </w:r>
-    </w:p>
-    <w:p>
-      <w:pPr>
-        <w:keepNext w:val="0"/>
-        <w:keepLines w:val="0"/>
-        <w:pageBreakBefore w:val="0"/>
-        <w:widowControl w:val="1"/>
-        <w:numPr>
-          <w:ilvl w:val="0"/>
-          <w:numId w:val="2"/>
-        </w:numPr>
-        <w:pBdr>
-          <w:top w:space="0" w:sz="0" w:val="nil"/>
-          <w:left w:space="0" w:sz="0" w:val="nil"/>
-          <w:bottom w:space="0" w:sz="0" w:val="nil"/>
-          <w:right w:space="0" w:sz="0" w:val="nil"/>
-          <w:between w:space="0" w:sz="0" w:val="nil"/>
-        </w:pBdr>
-        <w:shd w:fill="auto" w:val="clear"/>
-        <w:spacing w:after="160" w:before="0" w:line="259" w:lineRule="auto"/>
-        <w:ind w:left="720" w:right="0" w:hanging="360"/>
-        <w:jc w:val="left"/>
-        <w:rPr>
-          <w:b w:val="0"/>
-          <w:bCs w:val="0"/>
-          <w:i w:val="1"/>
-          <w:iCs w:val="1"/>
-          <w:smallCaps w:val="0"/>
-          <w:strike w:val="0"/>
-          <w:color w:val="0000ff"/>
-          <w:sz w:val="22"/>
-          <w:szCs w:val="22"/>
-          <w:u w:val="none"/>
-          <w:shd w:fill="auto" w:val="clear"/>
-          <w:vertAlign w:val="baseline"/>
-        </w:rPr>
-      </w:pPr>
-      <w:r>
-        <w:rPr>
-          <w:rFonts w:ascii="Calibri" w:cs="Calibri" w:eastAsia="Calibri" w:hAnsi="Calibri"/>
-          <w:b w:val="0"/>
-          <w:bCs w:val="0"/>
-          <w:i w:val="1"/>
-          <w:iCs w:val="1"/>
-          <w:smallCaps w:val="0"/>
-          <w:strike w:val="0"/>
-          <w:color w:val="0000ff"/>
-          <w:sz w:val="22"/>
-          <w:szCs w:val="22"/>
-          <w:u w:val="none"/>
-          <w:shd w:fill="auto" w:val="clear"/>
-          <w:vertAlign w:val="baseline"/>
-          <w:rtl w:val="0"/>
-        </w:rPr>
-        <w:t xml:space="preserve">Function Details: provide explanation for the data, validation, business logics, functionalities (for both normal cases and abnormal cases), etc. of the function so that the reader can image how it work.</w:t>
-      </w:r>
-    </w:p>
-    <w:p>
-      <w:pPr>
-        <w:rPr>
-          <w:i w:val="1"/>
-          <w:iCs w:val="1"/>
-          <w:color w:val="0000ff"/>
-        </w:rPr>
-      </w:pPr>
-      <w:r>
-        <w:rPr>
-          <w:i w:val="1"/>
-          <w:iCs w:val="1"/>
-          <w:color w:val="0000ff"/>
-          <w:rtl w:val="0"/>
-        </w:rPr>
-        <w:t xml:space="preserve">]</w:t>
-      </w:r>
+      <w:r>
+        <w:t>FE-01: Account Registration &amp; Login</w:t>
+      </w:r>
+    </w:p>
+    <w:p>
+      <w:pPr/>
+      <w:r>
+        <w:t>• Function trigger: Navigation to the landing page and clicking 'Register' or 'Login'.</w:t>
+      </w:r>
+    </w:p>
+    <w:p>
+      <w:pPr/>
+      <w:r>
+        <w:t>• Function description: Allows a Horse Owner to register their profile (email, password, fullname) and log in to manage their stable.</w:t>
+      </w:r>
+    </w:p>
+    <w:p>
+      <w:pPr/>
+      <w:r>
+        <w:t>• Business logic &amp; validations: Email and username must be unique and valid. Passwords must be hashed using BCrypt. Supports optional 2FA OTP verification via email.</w:t>
+      </w:r>
+    </w:p>
+    <w:p>
+      <w:pPr/>
     </w:p>
     <w:p>
       <w:pPr>
         <w:pStyle w:val="Heading3"/>
-        <w:rPr/>
       </w:pPr>
-      <w:bookmarkStart w:colFirst="0" w:colLast="0" w:name="_x37lflvhomg5" w:id="13"/>
-      <w:bookmarkEnd w:id="13"/>
-      <w:r>
-        <w:rPr>
-          <w:rtl w:val="0"/>
-        </w:rPr>
-        <w:t xml:space="preserve">b. &lt;&lt;Function Name 2&gt;&gt;</w:t>
-      </w:r>
+      <w:r>
+        <w:t>FE-02: Manage Owned Horses</w:t>
+      </w:r>
+    </w:p>
+    <w:p>
+      <w:pPr/>
+      <w:r>
+        <w:t>• Function trigger: Owner Dashboard -&gt; 'My Stable' -&gt; 'Register Horse' or 'Edit'.</w:t>
+      </w:r>
+    </w:p>
+    <w:p>
+      <w:pPr/>
+      <w:r>
+        <w:t>• Function description: Add new horses, update profiles (breed, sex, date of birth, avatar), and track active status.</w:t>
+      </w:r>
+    </w:p>
+    <w:p>
+      <w:pPr/>
+      <w:r>
+        <w:t>• Business logic &amp; validations: Horse name must be unique. Date of birth must be in the past. Standard initial performance rating set to 52.</w:t>
+      </w:r>
+    </w:p>
+    <w:p>
+      <w:pPr/>
     </w:p>
     <w:p>
       <w:pPr>
-        <w:rPr/>
+        <w:pStyle w:val="Heading3"/>
       </w:pPr>
       <w:r>
-        <w:rPr>
-          <w:rtl w:val="0"/>
-        </w:rPr>
-        <w:t xml:space="preserve">…</w:t>
-      </w:r>
+        <w:t>FE-03: View Horse Profiles &amp; Statistics</w:t>
+      </w:r>
+    </w:p>
+    <w:p>
+      <w:pPr/>
+      <w:r>
+        <w:t>• Function trigger: Owner Dashboard -&gt; Clicking a horse card in the stable list.</w:t>
+      </w:r>
+    </w:p>
+    <w:p>
+      <w:pPr/>
+      <w:r>
+        <w:t>• Function description: View complete horse stats: age, breed, current rating, total career starts, and win statistics.</w:t>
+      </w:r>
+    </w:p>
+    <w:p>
+      <w:pPr/>
+      <w:r>
+        <w:t>• Business logic &amp; validations: Displays dynamically calculated win rate: (total_wins / total_races) * 100.</w:t>
+      </w:r>
+    </w:p>
+    <w:p>
+      <w:pPr/>
+    </w:p>
+    <w:p>
+      <w:pPr>
+        <w:pStyle w:val="Heading3"/>
+      </w:pPr>
+      <w:r>
+        <w:t>FE-04: View Seasons, Meetings &amp; Schedules</w:t>
+      </w:r>
+    </w:p>
+    <w:p>
+      <w:pPr/>
+      <w:r>
+        <w:t>• Function trigger: Owner Dashboard -&gt; 'Fixtures &amp; Results'.</w:t>
+      </w:r>
+    </w:p>
+    <w:p>
+      <w:pPr/>
+      <w:r>
+        <w:t>• Function description: View active season details, upcoming race meetings, and individual race schedules.</w:t>
+      </w:r>
+    </w:p>
+    <w:p>
+      <w:pPr/>
+      <w:r>
+        <w:t>• Business logic &amp; validations: Read-only access. Shows races that are SCHEDULED, DECLARATION_OPEN, or RUNNING.</w:t>
+      </w:r>
+    </w:p>
+    <w:p>
+      <w:pPr/>
+    </w:p>
+    <w:p>
+      <w:pPr>
+        <w:pStyle w:val="Heading3"/>
+      </w:pPr>
+      <w:r>
+        <w:t>FE-05: Search Jockeys &amp; Send Race Invitations</w:t>
+      </w:r>
+    </w:p>
+    <w:p>
+      <w:pPr/>
+      <w:r>
+        <w:t>• Function trigger: Selecting an upcoming race -&gt; Clicking 'Invite Jockey' -&gt; Selecting from active Jockey list.</w:t>
+      </w:r>
+    </w:p>
+    <w:p>
+      <w:pPr/>
+      <w:r>
+        <w:t>• Function description: Search for eligible active jockeys and invite them to ride a specific horse in an upcoming race.</w:t>
+      </w:r>
+    </w:p>
+    <w:p>
+      <w:pPr/>
+      <w:r>
+        <w:t>• Business logic &amp; validations: Both horse and jockey must be registered for the corresponding Race Meeting. Horse rating must match the race rating class.</w:t>
+      </w:r>
+    </w:p>
+    <w:p>
+      <w:pPr/>
+    </w:p>
+    <w:p>
+      <w:pPr>
+        <w:pStyle w:val="Heading3"/>
+      </w:pPr>
+      <w:r>
+        <w:t>FE-06: Manage Invitation Responses &amp; Confirm Jockey</w:t>
+      </w:r>
+    </w:p>
+    <w:p>
+      <w:pPr/>
+      <w:r>
+        <w:t>• Function trigger: Owner Dashboard -&gt; 'Invitations Sent'.</w:t>
+      </w:r>
+    </w:p>
+    <w:p>
+      <w:pPr/>
+      <w:r>
+        <w:t>• Function description: View invitation status (PENDING, ACCEPTED, REJECTED, EXPIRED) and confirm the jockey.</w:t>
+      </w:r>
+    </w:p>
+    <w:p>
+      <w:pPr/>
+      <w:r>
+        <w:t>• Business logic &amp; validations: If jockey rejects, owner can re-invite. If accepted, status transitions to ENTRY: PENDING_ADMIN for Admin approval.</w:t>
+      </w:r>
+    </w:p>
+    <w:p>
+      <w:pPr/>
+    </w:p>
+    <w:p>
+      <w:pPr>
+        <w:pStyle w:val="Heading3"/>
+      </w:pPr>
+      <w:r>
+        <w:t>FE-07: Confirm Horse Participation in Race Entry</w:t>
+      </w:r>
+    </w:p>
+    <w:p>
+      <w:pPr/>
+      <w:r>
+        <w:t>• Function trigger: Admin approves the entry, owner verifies the final gate assignment.</w:t>
+      </w:r>
+    </w:p>
+    <w:p>
+      <w:pPr/>
+      <w:r>
+        <w:t>• Function description: Owner reviews the confirmed RaceEntry (jockey, horse, gate number).</w:t>
+      </w:r>
+    </w:p>
+    <w:p>
+      <w:pPr/>
+      <w:r>
+        <w:t>• Business logic &amp; validations: Weight allowance checked (e.g. sex allowance of 1.5kg for fillies/mares).</w:t>
+      </w:r>
+    </w:p>
+    <w:p>
+      <w:pPr/>
+    </w:p>
+    <w:p>
+      <w:pPr>
+        <w:pStyle w:val="Heading3"/>
+      </w:pPr>
+      <w:r>
+        <w:t>FE-08: Track Race Results &amp; Earnings</w:t>
+      </w:r>
+    </w:p>
+    <w:p>
+      <w:pPr/>
+      <w:r>
+        <w:t>• Function trigger: Owner Dashboard -&gt; 'History &amp; Earnings'.</w:t>
+      </w:r>
+    </w:p>
+    <w:p>
+      <w:pPr/>
+      <w:r>
+        <w:t>• Function description: View performance records, finishes, prize money earned, and rating adjustments after race publication.</w:t>
+      </w:r>
+    </w:p>
+    <w:p>
+      <w:pPr/>
+      <w:r>
+        <w:t>• Business logic &amp; validations: Prize money is calculated based on final position and race purse config.</w:t>
+      </w:r>
+    </w:p>
+    <w:p>
+      <w:pPr/>
     </w:p>
     <w:p>
       <w:pPr>
         <w:pStyle w:val="Heading2"/>
-        <w:rPr/>
       </w:pPr>
-      <w:bookmarkStart w:colFirst="0" w:colLast="0" w:name="_j7yp17xd3tz" w:id="14"/>
-      <w:bookmarkEnd w:id="14"/>
-      <w:r>
-        <w:rPr>
-          <w:rtl w:val="0"/>
-        </w:rPr>
-        <w:t xml:space="preserve">2. &lt;&lt;Feature Name 2&gt;&gt;</w:t>
+      <w:r>
+        <w:t>2. Jockey Participation Management</w:t>
       </w:r>
     </w:p>
     <w:p>
       <w:pPr>
-        <w:rPr/>
+        <w:pStyle w:val="Heading3"/>
       </w:pPr>
       <w:r>
-        <w:rPr>
-          <w:rtl w:val="0"/>
-        </w:rPr>
-        <w:t xml:space="preserve">…</w:t>
-      </w:r>
+        <w:t>FE-01: Account Registration &amp; Login</w:t>
+      </w:r>
+    </w:p>
+    <w:p>
+      <w:pPr/>
+      <w:r>
+        <w:t>• Function trigger: Jockey registration form on landing page.</w:t>
+      </w:r>
+    </w:p>
+    <w:p>
+      <w:pPr/>
+      <w:r>
+        <w:t>• Function description: Allows jockeys to register with their name, license info, and weight (kg) and log in.</w:t>
+      </w:r>
+    </w:p>
+    <w:p>
+      <w:pPr/>
+      <w:r>
+        <w:t>• Business logic &amp; validations: Jockey weight is critical for handicap weight calculation (must be between 52kg and 60kg).</w:t>
+      </w:r>
+    </w:p>
+    <w:p>
+      <w:pPr/>
     </w:p>
     <w:p>
       <w:pPr>
-        <w:rPr>
-          <w:rFonts w:ascii="Calibri" w:cs="Calibri" w:eastAsia="Calibri" w:hAnsi="Calibri"/>
-          <w:b w:val="1"/>
-          <w:bCs w:val="1"/>
-          <w:color w:val="c00000"/>
-          <w:sz w:val="32"/>
-          <w:szCs w:val="32"/>
-        </w:rPr>
+        <w:pStyle w:val="Heading3"/>
       </w:pPr>
-      <w:bookmarkStart w:colFirst="0" w:colLast="0" w:name="_v0t3173rqvec" w:id="15"/>
-      <w:bookmarkEnd w:id="15"/>
-      <w:r>
-        <w:br w:type="page"/>
-      </w:r>
-      <w:r>
-        <w:rPr>
-          <w:rtl w:val="0"/>
-        </w:rPr>
-      </w:r>
+      <w:r>
+        <w:t>FE-02: View Received Race Invitations</w:t>
+      </w:r>
+    </w:p>
+    <w:p>
+      <w:pPr/>
+      <w:r>
+        <w:t>• Function trigger: Jockey Dashboard -&gt; 'New Invitations'.</w:t>
+      </w:r>
+    </w:p>
+    <w:p>
+      <w:pPr/>
+      <w:r>
+        <w:t>• Function description: Display a list of pending invitations from horse owners, showing the race details, horse name, rating, and distance.</w:t>
+      </w:r>
+    </w:p>
+    <w:p>
+      <w:pPr/>
+      <w:r>
+        <w:t>• Business logic &amp; validations: Shows only invitations for races where the registration window is still open.</w:t>
+      </w:r>
+    </w:p>
+    <w:p>
+      <w:pPr/>
+    </w:p>
+    <w:p>
+      <w:pPr>
+        <w:pStyle w:val="Heading3"/>
+      </w:pPr>
+      <w:r>
+        <w:t>FE-03: Accept or Reject Invitations</w:t>
+      </w:r>
+    </w:p>
+    <w:p>
+      <w:pPr/>
+      <w:r>
+        <w:t>• Function trigger: Clicking 'Accept' or 'Reject' buttons next to the invitation card.</w:t>
+      </w:r>
+    </w:p>
+    <w:p>
+      <w:pPr/>
+      <w:r>
+        <w:t>• Function description: Jockey accepts to ride the horse, or rejects the invite.</w:t>
+      </w:r>
+    </w:p>
+    <w:p>
+      <w:pPr/>
+      <w:r>
+        <w:t>• Business logic &amp; validations: Accepting automatically creates a RaceEntry with status PENDING_ADMIN. Rejecting sets invite status to REJECTED.</w:t>
+      </w:r>
+    </w:p>
+    <w:p>
+      <w:pPr/>
+    </w:p>
+    <w:p>
+      <w:pPr>
+        <w:pStyle w:val="Heading3"/>
+      </w:pPr>
+      <w:r>
+        <w:t>FE-04: View Race &amp; Horse Details</w:t>
+      </w:r>
+    </w:p>
+    <w:p>
+      <w:pPr/>
+      <w:r>
+        <w:t>• Function trigger: Clicking on a confirmed race entry.</w:t>
+      </w:r>
+    </w:p>
+    <w:p>
+      <w:pPr/>
+      <w:r>
+        <w:t>• Function description: View detailed profile of the assigned horse, the track characteristics (turf/dirt), and distance.</w:t>
+      </w:r>
+    </w:p>
+    <w:p>
+      <w:pPr/>
+      <w:r>
+        <w:t>• Business logic &amp; validations: Integrates with horse statistics API.</w:t>
+      </w:r>
+    </w:p>
+    <w:p>
+      <w:pPr/>
+    </w:p>
+    <w:p>
+      <w:pPr>
+        <w:pStyle w:val="Heading3"/>
+      </w:pPr>
+      <w:r>
+        <w:t>FE-05: View Personal Race Schedule</w:t>
+      </w:r>
+    </w:p>
+    <w:p>
+      <w:pPr/>
+      <w:r>
+        <w:t>• Function trigger: Jockey Dashboard -&gt; 'My Calendar'.</w:t>
+      </w:r>
+    </w:p>
+    <w:p>
+      <w:pPr/>
+      <w:r>
+        <w:t>• Function description: View a calendar list of upcoming approved races they are scheduled to ride in.</w:t>
+      </w:r>
+    </w:p>
+    <w:p>
+      <w:pPr/>
+      <w:r>
+        <w:t>• Business logic &amp; validations: Jockeys cannot ride more than one horse per race.</w:t>
+      </w:r>
+    </w:p>
+    <w:p>
+      <w:pPr/>
+    </w:p>
+    <w:p>
+      <w:pPr>
+        <w:pStyle w:val="Heading3"/>
+      </w:pPr>
+      <w:r>
+        <w:t>FE-06: View Personal Race Results &amp; Achievements</w:t>
+      </w:r>
+    </w:p>
+    <w:p>
+      <w:pPr/>
+      <w:r>
+        <w:t>• Function trigger: Jockey Dashboard -&gt; 'Performance History'.</w:t>
+      </w:r>
+    </w:p>
+    <w:p>
+      <w:pPr/>
+      <w:r>
+        <w:t>• Function description: Track total races ridden, number of top-3 finishes, win rate, and total points accumulated.</w:t>
+      </w:r>
+    </w:p>
+    <w:p>
+      <w:pPr/>
+      <w:r>
+        <w:t>• Business logic &amp; validations: Updates total_races_participated and total_top3_finishes upon official race finalization.</w:t>
+      </w:r>
+    </w:p>
+    <w:p>
+      <w:pPr/>
+    </w:p>
+    <w:p>
+      <w:pPr>
+        <w:pStyle w:val="Heading2"/>
+      </w:pPr>
+      <w:r>
+        <w:t>3. Race Officiating System</w:t>
+      </w:r>
+    </w:p>
+    <w:p>
+      <w:pPr>
+        <w:pStyle w:val="Heading3"/>
+      </w:pPr>
+      <w:r>
+        <w:t>FE-01: Verify Horse Information &amp; Weight</w:t>
+      </w:r>
+    </w:p>
+    <w:p>
+      <w:pPr/>
+      <w:r>
+        <w:t>• Function trigger: Referee Dashboard -&gt; 'Pre-Race Weigh-In'.</w:t>
+      </w:r>
+    </w:p>
+    <w:p>
+      <w:pPr/>
+      <w:r>
+        <w:t>• Function description: Referee verifies the jockey's actual weight and the horse's identity prior to the race.</w:t>
+      </w:r>
+    </w:p>
+    <w:p>
+      <w:pPr/>
+      <w:r>
+        <w:t>• Business logic &amp; validations: Calculates carried weight (Jockey weight + handicap weight). Verifies it is within the allowed threshold of the race class.</w:t>
+      </w:r>
+    </w:p>
+    <w:p>
+      <w:pPr/>
+    </w:p>
+    <w:p>
+      <w:pPr>
+        <w:pStyle w:val="Heading3"/>
+      </w:pPr>
+      <w:r>
+        <w:t>FE-02: Monitor Race Progress</w:t>
+      </w:r>
+    </w:p>
+    <w:p>
+      <w:pPr/>
+      <w:r>
+        <w:t>• Function trigger: Referee Dashboard -&gt; Clicking 'Start Race' -&gt; Livestreaming interface.</w:t>
+      </w:r>
+    </w:p>
+    <w:p>
+      <w:pPr/>
+      <w:r>
+        <w:t>• Function description: Provides the referee with controls to monitor the live race stream and manage the live spectator chat window.</w:t>
+      </w:r>
+    </w:p>
+    <w:p>
+      <w:pPr/>
+      <w:r>
+        <w:t>• Business logic &amp; validations: Transitions race status from RACE_ASSIGNED to RUNNING.</w:t>
+      </w:r>
+    </w:p>
+    <w:p>
+      <w:pPr/>
+    </w:p>
+    <w:p>
+      <w:pPr>
+        <w:pStyle w:val="Heading3"/>
+      </w:pPr>
+      <w:r>
+        <w:t>FE-03: Record &amp; Handle Rule Violations</w:t>
+      </w:r>
+    </w:p>
+    <w:p>
+      <w:pPr/>
+      <w:r>
+        <w:t>• Function trigger: Clicking 'Report Incident' during or immediately after the race.</w:t>
+      </w:r>
+    </w:p>
+    <w:p>
+      <w:pPr/>
+      <w:r>
+        <w:t>• Function description: Referee records rules infractions (e.g. cutting lane, whip abuse) and penalties (disqualification, fines).</w:t>
+      </w:r>
+    </w:p>
+    <w:p>
+      <w:pPr/>
+      <w:r>
+        <w:t>• Business logic &amp; validations: A serious violation transitions RaceEntry status to DISQUALIFIED and results in final_position being null/disqualified.</w:t>
+      </w:r>
+    </w:p>
+    <w:p>
+      <w:pPr/>
+    </w:p>
+    <w:p>
+      <w:pPr>
+        <w:pStyle w:val="Heading3"/>
+      </w:pPr>
+      <w:r>
+        <w:t>FE-04: Approve &amp; Confirm Official Race Results</w:t>
+      </w:r>
+    </w:p>
+    <w:p>
+      <w:pPr/>
+      <w:r>
+        <w:t>• Function trigger: Referee Dashboard -&gt; 'Result Entry'.</w:t>
+      </w:r>
+    </w:p>
+    <w:p>
+      <w:pPr/>
+      <w:r>
+        <w:t>• Function description: Referee enters the final position and finish times for all horses, confirms the result.</w:t>
+      </w:r>
+    </w:p>
+    <w:p>
+      <w:pPr/>
+      <w:r>
+        <w:t>• Business logic &amp; validations: Transitions race status to OFFICIAL and triggers automatic rating updates and prize money calculation in the database.</w:t>
+      </w:r>
+    </w:p>
+    <w:p>
+      <w:pPr/>
+    </w:p>
+    <w:p>
+      <w:pPr>
+        <w:pStyle w:val="Heading3"/>
+      </w:pPr>
+      <w:r>
+        <w:t>FE-05: Create &amp; Store Race Reports</w:t>
+      </w:r>
+    </w:p>
+    <w:p>
+      <w:pPr/>
+      <w:r>
+        <w:t>• Function trigger: After race results are published, clicking 'Create Report'.</w:t>
+      </w:r>
+    </w:p>
+    <w:p>
+      <w:pPr/>
+      <w:r>
+        <w:t>• Function description: Form to save the official steward's report, summarizing violations, weather conditions, track status, and general comments.</w:t>
+      </w:r>
+    </w:p>
+    <w:p>
+      <w:pPr/>
+      <w:r>
+        <w:t>• Business logic &amp; validations: Saves to steward_report column in Race table.</w:t>
+      </w:r>
+    </w:p>
+    <w:p>
+      <w:pPr/>
+    </w:p>
+    <w:p>
+      <w:pPr>
+        <w:pStyle w:val="Heading2"/>
+      </w:pPr>
+      <w:r>
+        <w:t>4. Spectator Management System</w:t>
+      </w:r>
+    </w:p>
+    <w:p>
+      <w:pPr>
+        <w:pStyle w:val="Heading3"/>
+      </w:pPr>
+      <w:r>
+        <w:t>FE-01: Register &amp; Log In</w:t>
+      </w:r>
+    </w:p>
+    <w:p>
+      <w:pPr/>
+      <w:r>
+        <w:t>• Function trigger: Spectator signup button on the main page.</w:t>
+      </w:r>
+    </w:p>
+    <w:p>
+      <w:pPr/>
+      <w:r>
+        <w:t>• Function description: Registration of spectators for tracking favorite horses/jockeys and accessing AI chatbot history.</w:t>
+      </w:r>
+    </w:p>
+    <w:p>
+      <w:pPr/>
+      <w:r>
+        <w:t>• Business logic &amp; validations: Simple email registration, does not require weight validation.</w:t>
+      </w:r>
+    </w:p>
+    <w:p>
+      <w:pPr/>
+    </w:p>
+    <w:p>
+      <w:pPr>
+        <w:pStyle w:val="Heading3"/>
+      </w:pPr>
+      <w:r>
+        <w:t>FE-02: View Season, Meeting &amp; Race Information</w:t>
+      </w:r>
+    </w:p>
+    <w:p>
+      <w:pPr/>
+      <w:r>
+        <w:t>• Function trigger: Portal Landing -&gt; 'Schedules &amp; Info'.</w:t>
+      </w:r>
+    </w:p>
+    <w:p>
+      <w:pPr/>
+      <w:r>
+        <w:t>• Function description: Spectators browse current season standings, race meetings, list of races, and historical results.</w:t>
+      </w:r>
+    </w:p>
+    <w:p>
+      <w:pPr/>
+      <w:r>
+        <w:t>• Business logic &amp; validations: Read-only access to published data.</w:t>
+      </w:r>
+    </w:p>
+    <w:p>
+      <w:pPr/>
+    </w:p>
+    <w:p>
+      <w:pPr>
+        <w:pStyle w:val="Heading3"/>
+      </w:pPr>
+      <w:r>
+        <w:t>FE-03: Track Live Results &amp; Live Chat</w:t>
+      </w:r>
+    </w:p>
+    <w:p>
+      <w:pPr/>
+      <w:r>
+        <w:t>• Function trigger: Portal Landing -&gt; 'Watch Live'.</w:t>
+      </w:r>
+    </w:p>
+    <w:p>
+      <w:pPr/>
+      <w:r>
+        <w:t>• Function description: Watch live video streams of active races, view real-time gate positions, and participate in the public chat.</w:t>
+      </w:r>
+    </w:p>
+    <w:p>
+      <w:pPr/>
+      <w:r>
+        <w:t>• Business logic &amp; validations: Connects to backend via WebSocket (/ws/chat/{raceId}).</w:t>
+      </w:r>
+    </w:p>
+    <w:p>
+      <w:pPr/>
+    </w:p>
+    <w:p>
+      <w:pPr>
+        <w:pStyle w:val="Heading2"/>
+      </w:pPr>
+      <w:r>
+        <w:t>5. Race Management &amp; Administration System</w:t>
+      </w:r>
+    </w:p>
+    <w:p>
+      <w:pPr>
+        <w:pStyle w:val="Heading3"/>
+      </w:pPr>
+      <w:r>
+        <w:t>FE-01: Manage User Accounts</w:t>
+      </w:r>
+    </w:p>
+    <w:p>
+      <w:pPr/>
+      <w:r>
+        <w:t>• Function trigger: Admin Dashboard -&gt; 'User Management'.</w:t>
+      </w:r>
+    </w:p>
+    <w:p>
+      <w:pPr/>
+      <w:r>
+        <w:t>• Function description: List, edit, deactivate, or activate users (Owners, Jockeys, Referees, Spectators).</w:t>
+      </w:r>
+    </w:p>
+    <w:p>
+      <w:pPr/>
+      <w:r>
+        <w:t>• Business logic &amp; validations: Admins cannot delete their own account.</w:t>
+      </w:r>
+    </w:p>
+    <w:p>
+      <w:pPr/>
+    </w:p>
+    <w:p>
+      <w:pPr>
+        <w:pStyle w:val="Heading3"/>
+      </w:pPr>
+      <w:r>
+        <w:t>FE-02: Assign Role Permissions</w:t>
+      </w:r>
+    </w:p>
+    <w:p>
+      <w:pPr/>
+      <w:r>
+        <w:t>• Function trigger: Admin Dashboard -&gt; 'System Configuration'.</w:t>
+      </w:r>
+    </w:p>
+    <w:p>
+      <w:pPr/>
+      <w:r>
+        <w:t>• Function description: Configure and review security permissions and configuration values (e.g. MAX_TOP_WEIGHT, WEIGHT_PER_POINT).</w:t>
+      </w:r>
+    </w:p>
+    <w:p>
+      <w:pPr/>
+      <w:r>
+        <w:t>• Business logic &amp; validations: Persists settings in SystemConfig table.</w:t>
+      </w:r>
+    </w:p>
+    <w:p>
+      <w:pPr/>
+    </w:p>
+    <w:p>
+      <w:pPr>
+        <w:pStyle w:val="Heading3"/>
+      </w:pPr>
+      <w:r>
+        <w:t>FE-03: Manage Seasons, Meetings &amp; Races</w:t>
+      </w:r>
+    </w:p>
+    <w:p>
+      <w:pPr/>
+      <w:r>
+        <w:t>• Function trigger: Admin Dashboard -&gt; 'Tournament Management'.</w:t>
+      </w:r>
+    </w:p>
+    <w:p>
+      <w:pPr/>
+      <w:r>
+        <w:t>• Function description: Create and edit Seasons, add Race Meetings, and schedule individual races.</w:t>
+      </w:r>
+    </w:p>
+    <w:p>
+      <w:pPr/>
+      <w:r>
+        <w:t>• Business logic &amp; validations: Start date must be before end date. A race meeting must belong to an active season.</w:t>
+      </w:r>
+    </w:p>
+    <w:p>
+      <w:pPr/>
+    </w:p>
+    <w:p>
+      <w:pPr>
+        <w:pStyle w:val="Heading3"/>
+      </w:pPr>
+      <w:r>
+        <w:t>FE-04: Manage Season Class Rules</w:t>
+      </w:r>
+    </w:p>
+    <w:p>
+      <w:pPr/>
+      <w:r>
+        <w:t>• Function trigger: Admin Dashboard -&gt; 'Class Rules'.</w:t>
+      </w:r>
+    </w:p>
+    <w:p>
+      <w:pPr/>
+      <w:r>
+        <w:t>• Function description: Define rating brackets (min/max rating) and purse values for each race class (Class 1 to Class 5).</w:t>
+      </w:r>
+    </w:p>
+    <w:p>
+      <w:pPr/>
+      <w:r>
+        <w:t>• Business logic &amp; validations: Rules must not overlap in rating brackets.</w:t>
+      </w:r>
+    </w:p>
+    <w:p>
+      <w:pPr/>
+    </w:p>
+    <w:p>
+      <w:pPr>
+        <w:pStyle w:val="Heading3"/>
+      </w:pPr>
+      <w:r>
+        <w:t>FE-05: Approve Owner &amp; Jockey Registrations</w:t>
+      </w:r>
+    </w:p>
+    <w:p>
+      <w:pPr/>
+      <w:r>
+        <w:t>• Function trigger: Admin Dashboard -&gt; 'Registrations' -&gt; 'Approve / Reject'.</w:t>
+      </w:r>
+    </w:p>
+    <w:p>
+      <w:pPr/>
+      <w:r>
+        <w:t>• Function description: Review and approve jockeys and owners registering for a specific race meeting.</w:t>
+      </w:r>
+    </w:p>
+    <w:p>
+      <w:pPr/>
+      <w:r>
+        <w:t>• Business logic &amp; validations: Checks eligibility and licensing status.</w:t>
+      </w:r>
+    </w:p>
+    <w:p>
+      <w:pPr/>
+    </w:p>
+    <w:p>
+      <w:pPr>
+        <w:pStyle w:val="Heading3"/>
+      </w:pPr>
+      <w:r>
+        <w:t>FE-06: Assign Referees to Races</w:t>
+      </w:r>
+    </w:p>
+    <w:p>
+      <w:pPr/>
+      <w:r>
+        <w:t>• Function trigger: Admin Dashboard -&gt; 'Assign Referees'.</w:t>
+      </w:r>
+    </w:p>
+    <w:p>
+      <w:pPr/>
+      <w:r>
+        <w:t>• Function description: Select and assign certified referees to oversee scheduled races.</w:t>
+      </w:r>
+    </w:p>
+    <w:p>
+      <w:pPr/>
+      <w:r>
+        <w:t>• Business logic &amp; validations: A race can have one or more referees.</w:t>
+      </w:r>
+    </w:p>
+    <w:p>
+      <w:pPr/>
+    </w:p>
+    <w:p>
+      <w:pPr>
+        <w:pStyle w:val="Heading3"/>
+      </w:pPr>
+      <w:r>
+        <w:t>FE-07: Approve Race Entries</w:t>
+      </w:r>
+    </w:p>
+    <w:p>
+      <w:pPr/>
+      <w:r>
+        <w:t>• Function trigger: Admin Dashboard -&gt; 'Race Card Approval'.</w:t>
+      </w:r>
+    </w:p>
+    <w:p>
+      <w:pPr/>
+      <w:r>
+        <w:t>• Function description: Approve the final entries of jockeys and horses for a race after the declaration deadline closes.</w:t>
+      </w:r>
+    </w:p>
+    <w:p>
+      <w:pPr/>
+      <w:r>
+        <w:t>• Business logic &amp; validations: Automatically generates gate numbers randomly (1 to 14) and transitions entry status to APPROVED.</w:t>
+      </w:r>
+    </w:p>
+    <w:p>
+      <w:pPr/>
+    </w:p>
+    <w:p>
+      <w:pPr>
+        <w:pStyle w:val="Heading3"/>
+      </w:pPr>
+      <w:r>
+        <w:t>FE-08: Publish Official Race Results</w:t>
+      </w:r>
+    </w:p>
+    <w:p>
+      <w:pPr/>
+      <w:r>
+        <w:t>• Function trigger: Admin Dashboard -&gt; 'Publish Results'.</w:t>
+      </w:r>
+    </w:p>
+    <w:p>
+      <w:pPr/>
+      <w:r>
+        <w:t>• Function description: Reviews results entered by the referee and publishes them globally.</w:t>
+      </w:r>
+    </w:p>
+    <w:p>
+      <w:pPr/>
+      <w:r>
+        <w:t>• Business logic &amp; validations: Triggers season rating updates and unlocks prize earnings.</w:t>
+      </w:r>
+    </w:p>
+    <w:p>
+      <w:pPr/>
     </w:p>
     <w:p>
       <w:pPr>

</xml_diff>